<commit_message>
Bez nastavení hlasů, osvědčení bez reálného času, tisk jen osvědčení, aktualizace MP3
Co-Authored-By: Claude Sonnet 5.5 <noreply@anthropic.com>
Claude-Session: https://claude.ai/code/session_01BKFsGeQDyhk3kUyep8T56Z
</commit_message>
<xml_diff>
--- a/download/sablona-osvedceni.docx
+++ b/download/sablona-osvedceni.docx
@@ -106,20 +106,20 @@
         <w:rPr>
           <w:sz w:val="24"/>
         </w:rPr>
-        <w:t xml:space="preserve">absolvoval/a e-learningový kurz v rozsahu </w:t>
+        <w:t xml:space="preserve">úspěšně absolvoval/a e-learningový kurz v rozsahu </w:t>
       </w:r>
       <w:r>
         <w:rPr>
           <w:b/>
           <w:sz w:val="24"/>
         </w:rPr>
-        <w:t>6 hodin (360 minut)</w:t>
+        <w:t>6 hodin</w:t>
       </w:r>
       <w:r>
         <w:rPr>
           <w:sz w:val="24"/>
         </w:rPr>
-        <w:t>.</w:t>
+        <w:t xml:space="preserve"> včetně závěrečného testu.</w:t>
       </w:r>
     </w:p>
     <w:tbl>
@@ -146,7 +146,7 @@
                 <w:color w:val="566A6C"/>
                 <w:sz w:val="20"/>
               </w:rPr>
-              <w:t>Období studia</w:t>
+              <w:t>Datum vydání</w:t>
             </w:r>
           </w:p>
         </w:tc>
@@ -162,112 +162,7 @@
               <w:rPr>
                 <w:sz w:val="21"/>
               </w:rPr>
-              <w:t>[od – do, např. 1. 10. 2026 – 20. 10. 2026]</w:t>
-            </w:r>
-          </w:p>
-        </w:tc>
-      </w:tr>
-      <w:tr>
-        <w:tc>
-          <w:tcPr>
-            <w:tcW w:type="dxa" w:w="3118"/>
-          </w:tcPr>
-          <w:p>
-            <w:pPr>
-              <w:spacing w:after="60"/>
-            </w:pPr>
-            <w:r>
-              <w:rPr>
-                <w:color w:val="566A6C"/>
-                <w:sz w:val="20"/>
-              </w:rPr>
-              <w:t>Aktivní studium v aplikaci</w:t>
-            </w:r>
-          </w:p>
-        </w:tc>
-        <w:tc>
-          <w:tcPr>
-            <w:tcW w:type="dxa" w:w="6293"/>
-          </w:tcPr>
-          <w:p>
-            <w:pPr>
-              <w:spacing w:after="60"/>
-            </w:pPr>
-            <w:r>
-              <w:rPr>
-                <w:sz w:val="21"/>
-              </w:rPr>
-              <w:t>[počet] min</w:t>
-            </w:r>
-          </w:p>
-        </w:tc>
-      </w:tr>
-      <w:tr>
-        <w:tc>
-          <w:tcPr>
-            <w:tcW w:type="dxa" w:w="3118"/>
-          </w:tcPr>
-          <w:p>
-            <w:pPr>
-              <w:spacing w:after="60"/>
-            </w:pPr>
-            <w:r>
-              <w:rPr>
-                <w:color w:val="566A6C"/>
-                <w:sz w:val="20"/>
-              </w:rPr>
-              <w:t>Samostudium (čestné prohlášení)</w:t>
-            </w:r>
-          </w:p>
-        </w:tc>
-        <w:tc>
-          <w:tcPr>
-            <w:tcW w:type="dxa" w:w="6293"/>
-          </w:tcPr>
-          <w:p>
-            <w:pPr>
-              <w:spacing w:after="60"/>
-            </w:pPr>
-            <w:r>
-              <w:rPr>
-                <w:sz w:val="21"/>
-              </w:rPr>
-              <w:t>[počet] min  (vyplňte jen při čestném prohlášení)</w:t>
-            </w:r>
-          </w:p>
-        </w:tc>
-      </w:tr>
-      <w:tr>
-        <w:tc>
-          <w:tcPr>
-            <w:tcW w:type="dxa" w:w="3118"/>
-          </w:tcPr>
-          <w:p>
-            <w:pPr>
-              <w:spacing w:after="60"/>
-            </w:pPr>
-            <w:r>
-              <w:rPr>
-                <w:color w:val="566A6C"/>
-                <w:sz w:val="20"/>
-              </w:rPr>
-              <w:t>Závěrečný test</w:t>
-            </w:r>
-          </w:p>
-        </w:tc>
-        <w:tc>
-          <w:tcPr>
-            <w:tcW w:type="dxa" w:w="6293"/>
-          </w:tcPr>
-          <w:p>
-            <w:pPr>
-              <w:spacing w:after="60"/>
-            </w:pPr>
-            <w:r>
-              <w:rPr>
-                <w:sz w:val="21"/>
-              </w:rPr>
-              <w:t>[výsledek] %</w:t>
+              <w:t>[místo a datum vydání]</w:t>
             </w:r>
           </w:p>
         </w:tc>
@@ -415,7 +310,7 @@
     </w:tbl>
     <w:p>
       <w:pPr>
-        <w:spacing w:after="80"/>
+        <w:spacing w:after="440"/>
       </w:pPr>
       <w:r>
         <w:rPr>
@@ -424,50 +319,6 @@
           <w:caps w:val="0"/>
           <w:sz w:val="12"/>
         </w:rPr>
-      </w:r>
-    </w:p>
-    <w:p>
-      <w:pPr>
-        <w:spacing w:after="40"/>
-      </w:pPr>
-      <w:r>
-        <w:rPr>
-          <w:b/>
-          <w:i w:val="0"/>
-          <w:caps w:val="0"/>
-          <w:color w:val="566A6C"/>
-          <w:sz w:val="19"/>
-        </w:rPr>
-        <w:t>Čestné prohlášení účastníka (vyplňte, pokud účastník doložil část času samostudiem):</w:t>
-      </w:r>
-    </w:p>
-    <w:p>
-      <w:pPr>
-        <w:spacing w:after="320"/>
-      </w:pPr>
-      <w:r>
-        <w:rPr>
-          <w:b w:val="0"/>
-          <w:i/>
-          <w:caps w:val="0"/>
-          <w:color w:val="566A6C"/>
-          <w:sz w:val="19"/>
-        </w:rPr>
-        <w:t>Prohlašuji, že jsem [počet] minut věnoval/a činnostem souvisejícím s tématem kurzu: [činnosti].  [Stručný popis, co, kdy, s kým.]</w:t>
-      </w:r>
-    </w:p>
-    <w:p>
-      <w:pPr>
-        <w:spacing w:after="440"/>
-      </w:pPr>
-      <w:r>
-        <w:rPr>
-          <w:b w:val="0"/>
-          <w:i w:val="0"/>
-          <w:caps w:val="0"/>
-          <w:sz w:val="20"/>
-        </w:rPr>
-        <w:t>Místo a datum vydání: [místo, datum]</w:t>
       </w:r>
     </w:p>
     <w:tbl>

</xml_diff>